<commit_message>
made centralised critic as default in the training
</commit_message>
<xml_diff>
--- a/docs/Research_Proposal_Faithfulness_Decoupling.docx
+++ b/docs/Research_Proposal_Faithfulness_Decoupling.docx
@@ -985,7 +985,7 @@
           <w:sz w:val="22"/>
           <w:szCs w:val="22"/>
         </w:rPr>
-        <w:t>Fleet environment. Vehicle movement is simulated in SUMO (Simulation of Urban MObility) [22], the standard microscopic traffic simulator, on a real OpenStreetMap road network. SUMO is driven in-process through libsumo/TraCI, and its built-in taxi (dispatch) device supplies order reservations, assignment and pickup/drop-off, so the dispatch layer need not be rebuilt. We adopt a decentralised fleet-dispatch formulation [1, 5]: rather than a central dispatcher computing a global matching each step, every idle vehicle chooses independently whether to accept one of its K nearest pending reservations. Idle vehicles are agents that each step either stay idle or accept one of the K nearest pending reservations, giving an action space of Discrete(K+1). No explicit zone partition or learned repositioning is used; idle taxis default to the SUMO taxi device's randomCircling behaviour and become available for dispatch again on the next step. Each vehicle carries features: position, velocity, availability and Age of Information (AoI). Per-agent heterogeneous graph. For each acting vehicle, a small graph is constructed with three node types: self, K nearest neighbouring vehicles (to model fleet coordination) and K nearest pending reservations (the candidate assignments). Edges are implicit — the GAT layer attends over all valid nodes with a masked softmax, and edge weights are learned rather than pre-computed. Relative distance is provided as a node feature (Δx, Δy, ‖Δ‖ from self) rather than as an explicit edge attribute. Dispatcher: a MAPPO [5] backbone with a GAT [7] encoder that captures fleet interactions, producing the attention distributions used as explanations. Implementation uses Python, SUMO driven through the in-process libsumo backend, PyTorch and PettingZoo. The graph attention layer is a hand-rolled multi-head scaled dot-product attention rather than PyTorch Geometric's GATConv, so that attention weights are first-class return values of the forward pass and can be consumed directly by the faithfulness pipeline. This per-agent, decentralised graph is chosen deliberately: attention rows are then in one-to-one correspondence with a single vehicle's dispatch decision, allowing DEF and WAMSN to be evaluated on each decision independently rather than on an aggregate dispatcher output; AoI is likewise a per-agent quantity, matching the summands in the WAMSN definition (Section 7.4). A known drawback of decentralised dispatch is that multiple vehicles can converge on the same reservation without explicit coordination; the GAT's attention over neighbouring vehicles gives each agent implicit awareness of peers likely to compete for the same order, allowing coordination to emerge from the learned policy — whether that coordination signal is faithfully explained by attention is itself one of the questions DEF is designed to answer. A lightweight grid simulator (Lin et al. [1]) is kept as a fast fallback if SUMO stepping is too slow.</w:t>
+        <w:t>Fleet environment. Vehicle movement is simulated in SUMO (Simulation of Urban MObility) [22], the standard microscopic traffic simulator, on a real OpenStreetMap road network. SUMO is driven in-process through libsumo/TraCI, and its built-in taxi (dispatch) device supplies order reservations, assignment and pickup/drop-off, so the dispatch layer need not be rebuilt. We adopt a decentralised fleet-dispatch formulation [1, 5]: rather than a central dispatcher computing a global matching each step, every idle vehicle chooses independently whether to accept one of its K nearest pending reservations. Idle vehicles are agents that each step either stay idle or accept one of the K nearest pending reservations, giving an action space of Discrete(K+1). No explicit zone partition or learned repositioning is used; idle taxis default to the SUMO taxi device's randomCircling behaviour and become available for dispatch again on the next step. Each vehicle carries features: position, velocity, availability and Age of Information (AoI). Per-agent heterogeneous graph. For each acting vehicle, a small graph is constructed with three node types: self, K nearest neighbouring vehicles (to model fleet coordination) and K nearest pending reservations (the candidate assignments). Edges are implicit — the GAT layer attends over all valid nodes with a masked softmax, and edge weights are learned rather than pre-computed. Relative distance is provided as a node feature (Δx, Δy, ‖Δ‖ from self) rather than as an explicit edge attribute. Dispatcher: a MAPPO [5] backbone with a GAT [7] encoder that captures fleet interactions, producing the attention distributions used as explanations. Implementation uses Python, SUMO driven through the in-process libsumo backend, PyTorch and PettingZoo. The graph attention layer is a hand-rolled multi-head scaled dot-product attention rather than PyTorch Geometric's GATConv, so that attention weights are first-class return values of the forward pass and can be consumed directly by the faithfulness pipeline. This per-agent, decentralised graph is chosen deliberately: attention rows are then in one-to-one correspondence with a single vehicle's dispatch decision, allowing DEF and WAMSN to be evaluated on each decision independently rather than on an aggregate dispatcher output; AoI is likewise a per-agent quantity, matching the summands in the WAMSN definition (Section 7.4). A known drawback of decentralised dispatch is that multiple vehicles can converge on the same reservation without explicit coordination; the GAT's attention over neighbouring vehicles gives each agent implicit awareness of peers likely to compete for the same order, allowing coordination to emerge from the learned policy — whether that coordination signal is faithfully explained by attention is itself one of the questions DEF is designed to answer.</w:t>
       </w:r>
     </w:p>
     <w:p>
@@ -2543,7 +2543,7 @@
           <w:sz w:val="22"/>
           <w:szCs w:val="22"/>
         </w:rPr>
-        <w:t xml:space="preserve">The dispatcher is trained with MAPPO under centralised-training / decentralised-execution. All vehicles share one GAT actor π(a_i | o_i) — a GATv2 encoder over the vehicle graph feeding an action head over {stay, reposition to a neighbour zone, accept order} with invalid-action masking — while a centralised critic V(s) is used only in training to cut variance and dropped at deployment. Each iteration collects rollouts from SUMO (one environment, the fleet supplying a batch of agent samples per step, since SUMO stepping not the GPU is the bottleneck), computes GAE advantages (γ = 0.99, λ = 0.95), and updates both networks with the clipped PPO objective (ε = 0.2) plus value and entropy terms until episode reward plateaus. Reward shaping encourages cooperation: positive for orders served, negative for waiting time, small penalty for empty repositioning. Attention is read out for explanation, not optimised. To isolate the phenomenon, B0–B3 are obtained on clean telemetry and evaluated on clean and degraded episodes (RQ1–RQ3); the AoI-aware mitigation adds the freshness signal and sees tunnel degradation during training (RQ4). PPO is reused from a maintained MAPPO library with a PyTorch Geometric GAT encoder, not reimplemented.</w:t>
+        <w:t>The dispatcher is trained with MAPPO under centralised-training / decentralised-execution. All vehicles share one GAT actor π(a_i | o_i) — a hand-rolled multi-head attention encoder over the per-agent heterogeneous graph (self + K nearest neighbouring vehicles + K nearest pending reservations) feeding an action head of Discrete(K+1) — either stay idle or accept one of the K candidate reservations — with invalid-reservation masking — while a centralised critic V(s) is used only in training to cut variance and dropped at deployment. Each iteration collects rollouts from SUMO (one environment, the fleet supplying a batch of agent samples per step, since SUMO stepping not the GPU is the bottleneck), computes GAE advantages (γ = 0.99, λ = 0.95), and updates both networks with the clipped PPO objective (ε = 0.2) plus value and entropy terms until episode reward plateaus. Reward shaping encourages cooperation: positive per completed pickup and per successful dispatch attempt, negative in proportion to the mean pending-rider waiting time. No repositioning penalty is used because repositioning is not part of the action space. Attention is read out for explanation, not optimised. To isolate the phenomenon, B0–B3 are obtained on clean telemetry and evaluated on clean and degraded episodes (RQ1–RQ3); the AoI-aware mitigation adds the freshness signal and sees tunnel degradation during training (RQ4). The MAPPO training loop and the multi-head attention encoder are implemented from scratch in `src/dispatch_marl/` so that attention weights remain first-class outputs of the policy's forward pass — a requirement for the faithfulness pipeline of §7.4 rather than a design preference.</w:t>
       </w:r>
     </w:p>
     <w:p>
@@ -2613,7 +2613,7 @@
           <w:sz w:val="22"/>
           <w:szCs w:val="22"/>
         </w:rPr>
-        <w:t xml:space="preserve">Open a GPU runtime (Runtime → Change runtime type → GPU). In the first cell install pinned dependencies: eclipse-sumo, libsumo, traci, torch, torch-geometric, pettingzoo, pandas, pyarrow, numpy, matplotlib; set the SUMO_HOME environment variable.</w:t>
+        <w:t>Open a GPU runtime (Runtime → Change runtime type → GPU). In the first cell install pinned dependencies: eclipse-sumo, libsumo, traci, torch, pettingzoo, pandas, pyarrow, numpy, matplotlib; set the SUMO_HOME environment variable.</w:t>
       </w:r>
     </w:p>
     <w:p>
@@ -4012,7 +4012,7 @@
           <w:sz w:val="22"/>
           <w:szCs w:val="22"/>
         </w:rPr>
-        <w:t xml:space="preserve">MARL training is the main risk in an eleven-week window spanning SUMO, GAT, MAPPO and explainability evaluation. The project is therefore staged so that each stage is a self-contained, usable deliverable: Stage 1 — SUMO environment, greedy dispatch (B0) and the telemetry-degradation pipeline; Stage 2 — the MAPPO dispatcher (B1); Stage 3 — the GAT-MAPPO model (B2–B3); Stage 4 — the DEF and WAMSN faithfulness experiments. If MARL training overruns, faithfulness decoupling can still be studied on an earlier stage (e.g. the MAPPO model), and the plan additionally reuses a maintained MAPPO implementation, reduces fleet size and model complexity, falls back to the lightweight grid simulator (§7.1), and prioritises the DEF/WAMSN experiments over dispatch-performance tuning — since the contribution is measuring decoupling, not building a state-of-the-art dispatcher.</w:t>
+        <w:t>MARL training is the main risk in an eleven-week window spanning SUMO, GAT, MAPPO and explainability evaluation. The project is therefore staged so that each stage is a self-contained, usable deliverable: Stage 1 — SUMO environment, greedy dispatch (B0) and the telemetry-degradation pipeline; Stage 2 — the MAPPO dispatcher (B1); Stage 3 — the GAT-MAPPO model (B2–B3); Stage 4 — the DEF and WAMSN faithfulness experiments. If MARL training overruns, faithfulness decoupling can still be studied on an earlier stage (e.g. the MAPPO model), and the plan additionally reuses a maintained MAPPO implementation, reduces fleet size and model complexity, and prioritises the DEF/WAMSN experiments over dispatch-performance tuning — since the contribution is measuring decoupling, not building a state-of-the-art dispatcher.</w:t>
       </w:r>
     </w:p>
     <w:p>

</xml_diff>